<commit_message>
Add implementation code to transformation reports
</commit_message>
<xml_diff>
--- a/BasicTransformations2D/docs/BasicTransformations2D_Experiment_Report.docx
+++ b/BasicTransformations2D/docs/BasicTransformations2D_Experiment_Report.docx
@@ -760,6 +760,132 @@
           <w:b/>
           <w:sz w:val="24"/>
         </w:rPr>
+        <w:t>Relevant Implementation Code:</w:t>
+      </w:r>
+    </w:p>
+    <w:p>
+      <w:pPr>
+        <w:spacing w:before="0" w:after="120"/>
+        <w:jc w:val="both"/>
+      </w:pPr>
+      <w:r>
+        <w:rPr>
+          <w:rFonts w:ascii="Times New Roman" w:hAnsi="Times New Roman"/>
+          <w:sz w:val="22"/>
+        </w:rPr>
+        <w:t>The following excerpt constructs the selected homogeneous matrix and applies it to every polygon vertex. The same function is used by the report generator and the interactive visualizer.</w:t>
+      </w:r>
+    </w:p>
+    <w:p>
+      <w:pPr>
+        <w:spacing w:before="40" w:after="160"/>
+        <w:ind w:left="360"/>
+      </w:pPr>
+      <w:r>
+        <w:rPr>
+          <w:rFonts w:ascii="Courier New" w:hAnsi="Courier New"/>
+          <w:sz w:val="18"/>
+        </w:rPr>
+        <w:t>def apply_transformation(vertices, transform_name, params):</w:t>
+        <w:br/>
+      </w:r>
+      <w:r>
+        <w:rPr>
+          <w:rFonts w:ascii="Courier New" w:hAnsi="Courier New"/>
+          <w:sz w:val="18"/>
+        </w:rPr>
+        <w:t xml:space="preserve">    if transform_name == "translation":</w:t>
+        <w:br/>
+      </w:r>
+      <w:r>
+        <w:rPr>
+          <w:rFonts w:ascii="Courier New" w:hAnsi="Courier New"/>
+          <w:sz w:val="18"/>
+        </w:rPr>
+        <w:t xml:space="preserve">        M = translation_matrix(params["tx"], params["ty"])</w:t>
+        <w:br/>
+      </w:r>
+      <w:r>
+        <w:rPr>
+          <w:rFonts w:ascii="Courier New" w:hAnsi="Courier New"/>
+          <w:sz w:val="18"/>
+        </w:rPr>
+        <w:t xml:space="preserve">    elif transform_name == "scaling":</w:t>
+        <w:br/>
+      </w:r>
+      <w:r>
+        <w:rPr>
+          <w:rFonts w:ascii="Courier New" w:hAnsi="Courier New"/>
+          <w:sz w:val="18"/>
+        </w:rPr>
+        <w:t xml:space="preserve">        M = scaling_matrix(params["sx"], params["sy"])</w:t>
+        <w:br/>
+      </w:r>
+      <w:r>
+        <w:rPr>
+          <w:rFonts w:ascii="Courier New" w:hAnsi="Courier New"/>
+          <w:sz w:val="18"/>
+        </w:rPr>
+        <w:t xml:space="preserve">    elif transform_name == "rotation":</w:t>
+        <w:br/>
+      </w:r>
+      <w:r>
+        <w:rPr>
+          <w:rFonts w:ascii="Courier New" w:hAnsi="Courier New"/>
+          <w:sz w:val="18"/>
+        </w:rPr>
+        <w:t xml:space="preserve">        M = rotation_matrix(params["angle_deg"])</w:t>
+        <w:br/>
+      </w:r>
+      <w:r>
+        <w:rPr>
+          <w:rFonts w:ascii="Courier New" w:hAnsi="Courier New"/>
+          <w:sz w:val="18"/>
+        </w:rPr>
+        <w:t xml:space="preserve">    else:</w:t>
+        <w:br/>
+      </w:r>
+      <w:r>
+        <w:rPr>
+          <w:rFonts w:ascii="Courier New" w:hAnsi="Courier New"/>
+          <w:sz w:val="18"/>
+        </w:rPr>
+        <w:t xml:space="preserve">        raise ValueError(f"Unknown transformation: {transform_name}")</w:t>
+        <w:br/>
+      </w:r>
+      <w:r>
+        <w:rPr>
+          <w:rFonts w:ascii="Courier New" w:hAnsi="Courier New"/>
+          <w:sz w:val="18"/>
+        </w:rPr>
+        <w:br/>
+      </w:r>
+      <w:r>
+        <w:rPr>
+          <w:rFonts w:ascii="Courier New" w:hAnsi="Courier New"/>
+          <w:sz w:val="18"/>
+        </w:rPr>
+        <w:t xml:space="preserve">    transformed = [mat3_transform_point(M, x, y) for x, y in vertices]</w:t>
+        <w:br/>
+      </w:r>
+      <w:r>
+        <w:rPr>
+          <w:rFonts w:ascii="Courier New" w:hAnsi="Courier New"/>
+          <w:sz w:val="18"/>
+        </w:rPr>
+        <w:t xml:space="preserve">    return transformed, M</w:t>
+      </w:r>
+    </w:p>
+    <w:p>
+      <w:pPr>
+        <w:spacing w:before="80" w:after="40"/>
+      </w:pPr>
+      <w:r>
+        <w:rPr>
+          <w:rFonts w:ascii="Times New Roman" w:hAnsi="Times New Roman"/>
+          <w:b/>
+          <w:sz w:val="24"/>
+        </w:rPr>
         <w:t>Test Case 1 - Translation (tx=4, ty=3)</w:t>
       </w:r>
     </w:p>

</xml_diff>

<commit_message>
Separate implementation and test case report sections
</commit_message>
<xml_diff>
--- a/BasicTransformations2D/docs/BasicTransformations2D_Experiment_Report.docx
+++ b/BasicTransformations2D/docs/BasicTransformations2D_Experiment_Report.docx
@@ -365,7 +365,290 @@
           <w:b/>
           <w:sz w:val="26"/>
         </w:rPr>
-        <w:t>Implementation &amp; Test Cases:</w:t>
+        <w:t>Implementation:</w:t>
+      </w:r>
+    </w:p>
+    <w:p>
+      <w:pPr>
+        <w:spacing w:before="0" w:after="120"/>
+        <w:jc w:val="both"/>
+      </w:pPr>
+      <w:r>
+        <w:rPr>
+          <w:rFonts w:ascii="Times New Roman" w:hAnsi="Times New Roman"/>
+          <w:sz w:val="22"/>
+        </w:rPr>
+        <w:t>The implementation represents every 2D point in homogeneous form and applies one 3x3 matrix for the selected operation. Translation changes the final column, scaling changes the diagonal entries, and rotation is built from the sine and cosine of the angle.</w:t>
+      </w:r>
+    </w:p>
+    <w:p>
+      <w:pPr>
+        <w:spacing w:before="80" w:after="40"/>
+      </w:pPr>
+      <w:r>
+        <w:rPr>
+          <w:rFonts w:ascii="Times New Roman" w:hAnsi="Times New Roman"/>
+          <w:b/>
+          <w:sz w:val="24"/>
+        </w:rPr>
+        <w:t>Translation, Scaling, and Rotation Code:</w:t>
+      </w:r>
+    </w:p>
+    <w:p>
+      <w:pPr>
+        <w:spacing w:before="40" w:after="160"/>
+        <w:ind w:left="360"/>
+      </w:pPr>
+      <w:r>
+        <w:rPr>
+          <w:rFonts w:ascii="Courier New" w:hAnsi="Courier New"/>
+          <w:sz w:val="18"/>
+        </w:rPr>
+        <w:t>def translation_matrix(tx, ty):</w:t>
+        <w:br/>
+      </w:r>
+      <w:r>
+        <w:rPr>
+          <w:rFonts w:ascii="Courier New" w:hAnsi="Courier New"/>
+          <w:sz w:val="18"/>
+        </w:rPr>
+        <w:t xml:space="preserve">    return [[1.0, 0.0, float(tx)],</w:t>
+        <w:br/>
+      </w:r>
+      <w:r>
+        <w:rPr>
+          <w:rFonts w:ascii="Courier New" w:hAnsi="Courier New"/>
+          <w:sz w:val="18"/>
+        </w:rPr>
+        <w:t xml:space="preserve">            [0.0, 1.0, float(ty)],</w:t>
+        <w:br/>
+      </w:r>
+      <w:r>
+        <w:rPr>
+          <w:rFonts w:ascii="Courier New" w:hAnsi="Courier New"/>
+          <w:sz w:val="18"/>
+        </w:rPr>
+        <w:t xml:space="preserve">            [0.0, 0.0, 1.0]]</w:t>
+        <w:br/>
+      </w:r>
+      <w:r>
+        <w:rPr>
+          <w:rFonts w:ascii="Courier New" w:hAnsi="Courier New"/>
+          <w:sz w:val="18"/>
+        </w:rPr>
+        <w:br/>
+      </w:r>
+      <w:r>
+        <w:rPr>
+          <w:rFonts w:ascii="Courier New" w:hAnsi="Courier New"/>
+          <w:sz w:val="18"/>
+        </w:rPr>
+        <w:t>def scaling_matrix(sx, sy):</w:t>
+        <w:br/>
+      </w:r>
+      <w:r>
+        <w:rPr>
+          <w:rFonts w:ascii="Courier New" w:hAnsi="Courier New"/>
+          <w:sz w:val="18"/>
+        </w:rPr>
+        <w:t xml:space="preserve">    return [[float(sx), 0.0, 0.0],</w:t>
+        <w:br/>
+      </w:r>
+      <w:r>
+        <w:rPr>
+          <w:rFonts w:ascii="Courier New" w:hAnsi="Courier New"/>
+          <w:sz w:val="18"/>
+        </w:rPr>
+        <w:t xml:space="preserve">            [0.0, float(sy), 0.0],</w:t>
+        <w:br/>
+      </w:r>
+      <w:r>
+        <w:rPr>
+          <w:rFonts w:ascii="Courier New" w:hAnsi="Courier New"/>
+          <w:sz w:val="18"/>
+        </w:rPr>
+        <w:t xml:space="preserve">            [0.0, 0.0, 1.0]]</w:t>
+        <w:br/>
+      </w:r>
+      <w:r>
+        <w:rPr>
+          <w:rFonts w:ascii="Courier New" w:hAnsi="Courier New"/>
+          <w:sz w:val="18"/>
+        </w:rPr>
+        <w:br/>
+      </w:r>
+      <w:r>
+        <w:rPr>
+          <w:rFonts w:ascii="Courier New" w:hAnsi="Courier New"/>
+          <w:sz w:val="18"/>
+        </w:rPr>
+        <w:t>def rotation_matrix(angle_deg):</w:t>
+        <w:br/>
+      </w:r>
+      <w:r>
+        <w:rPr>
+          <w:rFonts w:ascii="Courier New" w:hAnsi="Courier New"/>
+          <w:sz w:val="18"/>
+        </w:rPr>
+        <w:t xml:space="preserve">    theta = math.radians(angle_deg)</w:t>
+        <w:br/>
+      </w:r>
+      <w:r>
+        <w:rPr>
+          <w:rFonts w:ascii="Courier New" w:hAnsi="Courier New"/>
+          <w:sz w:val="18"/>
+        </w:rPr>
+        <w:t xml:space="preserve">    c, s = math.cos(theta), math.sin(theta)</w:t>
+        <w:br/>
+      </w:r>
+      <w:r>
+        <w:rPr>
+          <w:rFonts w:ascii="Courier New" w:hAnsi="Courier New"/>
+          <w:sz w:val="18"/>
+        </w:rPr>
+        <w:t xml:space="preserve">    return [[c, -s, 0.0],</w:t>
+        <w:br/>
+      </w:r>
+      <w:r>
+        <w:rPr>
+          <w:rFonts w:ascii="Courier New" w:hAnsi="Courier New"/>
+          <w:sz w:val="18"/>
+        </w:rPr>
+        <w:t xml:space="preserve">            [s, c, 0.0],</w:t>
+        <w:br/>
+      </w:r>
+      <w:r>
+        <w:rPr>
+          <w:rFonts w:ascii="Courier New" w:hAnsi="Courier New"/>
+          <w:sz w:val="18"/>
+        </w:rPr>
+        <w:t xml:space="preserve">            [0.0, 0.0, 1.0]]</w:t>
+      </w:r>
+    </w:p>
+    <w:p>
+      <w:pPr>
+        <w:spacing w:before="80" w:after="40"/>
+      </w:pPr>
+      <w:r>
+        <w:rPr>
+          <w:rFonts w:ascii="Times New Roman" w:hAnsi="Times New Roman"/>
+          <w:b/>
+          <w:sz w:val="24"/>
+        </w:rPr>
+        <w:t>Applying the Selected Transformation:</w:t>
+      </w:r>
+    </w:p>
+    <w:p>
+      <w:pPr>
+        <w:spacing w:before="40" w:after="160"/>
+        <w:ind w:left="360"/>
+      </w:pPr>
+      <w:r>
+        <w:rPr>
+          <w:rFonts w:ascii="Courier New" w:hAnsi="Courier New"/>
+          <w:sz w:val="18"/>
+        </w:rPr>
+        <w:t>def apply_transformation(vertices, transform_name, params):</w:t>
+        <w:br/>
+      </w:r>
+      <w:r>
+        <w:rPr>
+          <w:rFonts w:ascii="Courier New" w:hAnsi="Courier New"/>
+          <w:sz w:val="18"/>
+        </w:rPr>
+        <w:t xml:space="preserve">    if transform_name == "translation":</w:t>
+        <w:br/>
+      </w:r>
+      <w:r>
+        <w:rPr>
+          <w:rFonts w:ascii="Courier New" w:hAnsi="Courier New"/>
+          <w:sz w:val="18"/>
+        </w:rPr>
+        <w:t xml:space="preserve">        M = translation_matrix(params["tx"], params["ty"])</w:t>
+        <w:br/>
+      </w:r>
+      <w:r>
+        <w:rPr>
+          <w:rFonts w:ascii="Courier New" w:hAnsi="Courier New"/>
+          <w:sz w:val="18"/>
+        </w:rPr>
+        <w:t xml:space="preserve">    elif transform_name == "scaling":</w:t>
+        <w:br/>
+      </w:r>
+      <w:r>
+        <w:rPr>
+          <w:rFonts w:ascii="Courier New" w:hAnsi="Courier New"/>
+          <w:sz w:val="18"/>
+        </w:rPr>
+        <w:t xml:space="preserve">        M = scaling_matrix(params["sx"], params["sy"])</w:t>
+        <w:br/>
+      </w:r>
+      <w:r>
+        <w:rPr>
+          <w:rFonts w:ascii="Courier New" w:hAnsi="Courier New"/>
+          <w:sz w:val="18"/>
+        </w:rPr>
+        <w:t xml:space="preserve">    elif transform_name == "rotation":</w:t>
+        <w:br/>
+      </w:r>
+      <w:r>
+        <w:rPr>
+          <w:rFonts w:ascii="Courier New" w:hAnsi="Courier New"/>
+          <w:sz w:val="18"/>
+        </w:rPr>
+        <w:t xml:space="preserve">        M = rotation_matrix(params["angle_deg"])</w:t>
+        <w:br/>
+      </w:r>
+      <w:r>
+        <w:rPr>
+          <w:rFonts w:ascii="Courier New" w:hAnsi="Courier New"/>
+          <w:sz w:val="18"/>
+        </w:rPr>
+        <w:t xml:space="preserve">    else:</w:t>
+        <w:br/>
+      </w:r>
+      <w:r>
+        <w:rPr>
+          <w:rFonts w:ascii="Courier New" w:hAnsi="Courier New"/>
+          <w:sz w:val="18"/>
+        </w:rPr>
+        <w:t xml:space="preserve">        raise ValueError(f"Unknown transformation: {transform_name}")</w:t>
+        <w:br/>
+      </w:r>
+      <w:r>
+        <w:rPr>
+          <w:rFonts w:ascii="Courier New" w:hAnsi="Courier New"/>
+          <w:sz w:val="18"/>
+        </w:rPr>
+        <w:br/>
+      </w:r>
+      <w:r>
+        <w:rPr>
+          <w:rFonts w:ascii="Courier New" w:hAnsi="Courier New"/>
+          <w:sz w:val="18"/>
+        </w:rPr>
+        <w:t xml:space="preserve">    transformed = [mat3_transform_point(M, x, y) for x, y in vertices]</w:t>
+        <w:br/>
+      </w:r>
+      <w:r>
+        <w:rPr>
+          <w:rFonts w:ascii="Courier New" w:hAnsi="Courier New"/>
+          <w:sz w:val="18"/>
+        </w:rPr>
+        <w:t xml:space="preserve">    return transformed, M</w:t>
+      </w:r>
+    </w:p>
+    <w:p>
+      <w:pPr>
+        <w:spacing w:before="160" w:after="80"/>
+      </w:pPr>
+      <w:r>
+        <w:rPr>
+          <w:rFonts w:ascii="Times New Roman" w:hAnsi="Times New Roman"/>
+          <w:b/>
+          <w:sz w:val="26"/>
+        </w:rPr>
+        <w:t>Test Cases:</w:t>
       </w:r>
     </w:p>
     <w:tbl>
@@ -760,132 +1043,6 @@
           <w:b/>
           <w:sz w:val="24"/>
         </w:rPr>
-        <w:t>Relevant Implementation Code:</w:t>
-      </w:r>
-    </w:p>
-    <w:p>
-      <w:pPr>
-        <w:spacing w:before="0" w:after="120"/>
-        <w:jc w:val="both"/>
-      </w:pPr>
-      <w:r>
-        <w:rPr>
-          <w:rFonts w:ascii="Times New Roman" w:hAnsi="Times New Roman"/>
-          <w:sz w:val="22"/>
-        </w:rPr>
-        <w:t>The following excerpt constructs the selected homogeneous matrix and applies it to every polygon vertex. The same function is used by the report generator and the interactive visualizer.</w:t>
-      </w:r>
-    </w:p>
-    <w:p>
-      <w:pPr>
-        <w:spacing w:before="40" w:after="160"/>
-        <w:ind w:left="360"/>
-      </w:pPr>
-      <w:r>
-        <w:rPr>
-          <w:rFonts w:ascii="Courier New" w:hAnsi="Courier New"/>
-          <w:sz w:val="18"/>
-        </w:rPr>
-        <w:t>def apply_transformation(vertices, transform_name, params):</w:t>
-        <w:br/>
-      </w:r>
-      <w:r>
-        <w:rPr>
-          <w:rFonts w:ascii="Courier New" w:hAnsi="Courier New"/>
-          <w:sz w:val="18"/>
-        </w:rPr>
-        <w:t xml:space="preserve">    if transform_name == "translation":</w:t>
-        <w:br/>
-      </w:r>
-      <w:r>
-        <w:rPr>
-          <w:rFonts w:ascii="Courier New" w:hAnsi="Courier New"/>
-          <w:sz w:val="18"/>
-        </w:rPr>
-        <w:t xml:space="preserve">        M = translation_matrix(params["tx"], params["ty"])</w:t>
-        <w:br/>
-      </w:r>
-      <w:r>
-        <w:rPr>
-          <w:rFonts w:ascii="Courier New" w:hAnsi="Courier New"/>
-          <w:sz w:val="18"/>
-        </w:rPr>
-        <w:t xml:space="preserve">    elif transform_name == "scaling":</w:t>
-        <w:br/>
-      </w:r>
-      <w:r>
-        <w:rPr>
-          <w:rFonts w:ascii="Courier New" w:hAnsi="Courier New"/>
-          <w:sz w:val="18"/>
-        </w:rPr>
-        <w:t xml:space="preserve">        M = scaling_matrix(params["sx"], params["sy"])</w:t>
-        <w:br/>
-      </w:r>
-      <w:r>
-        <w:rPr>
-          <w:rFonts w:ascii="Courier New" w:hAnsi="Courier New"/>
-          <w:sz w:val="18"/>
-        </w:rPr>
-        <w:t xml:space="preserve">    elif transform_name == "rotation":</w:t>
-        <w:br/>
-      </w:r>
-      <w:r>
-        <w:rPr>
-          <w:rFonts w:ascii="Courier New" w:hAnsi="Courier New"/>
-          <w:sz w:val="18"/>
-        </w:rPr>
-        <w:t xml:space="preserve">        M = rotation_matrix(params["angle_deg"])</w:t>
-        <w:br/>
-      </w:r>
-      <w:r>
-        <w:rPr>
-          <w:rFonts w:ascii="Courier New" w:hAnsi="Courier New"/>
-          <w:sz w:val="18"/>
-        </w:rPr>
-        <w:t xml:space="preserve">    else:</w:t>
-        <w:br/>
-      </w:r>
-      <w:r>
-        <w:rPr>
-          <w:rFonts w:ascii="Courier New" w:hAnsi="Courier New"/>
-          <w:sz w:val="18"/>
-        </w:rPr>
-        <w:t xml:space="preserve">        raise ValueError(f"Unknown transformation: {transform_name}")</w:t>
-        <w:br/>
-      </w:r>
-      <w:r>
-        <w:rPr>
-          <w:rFonts w:ascii="Courier New" w:hAnsi="Courier New"/>
-          <w:sz w:val="18"/>
-        </w:rPr>
-        <w:br/>
-      </w:r>
-      <w:r>
-        <w:rPr>
-          <w:rFonts w:ascii="Courier New" w:hAnsi="Courier New"/>
-          <w:sz w:val="18"/>
-        </w:rPr>
-        <w:t xml:space="preserve">    transformed = [mat3_transform_point(M, x, y) for x, y in vertices]</w:t>
-        <w:br/>
-      </w:r>
-      <w:r>
-        <w:rPr>
-          <w:rFonts w:ascii="Courier New" w:hAnsi="Courier New"/>
-          <w:sz w:val="18"/>
-        </w:rPr>
-        <w:t xml:space="preserve">    return transformed, M</w:t>
-      </w:r>
-    </w:p>
-    <w:p>
-      <w:pPr>
-        <w:spacing w:before="80" w:after="40"/>
-      </w:pPr>
-      <w:r>
-        <w:rPr>
-          <w:rFonts w:ascii="Times New Roman" w:hAnsi="Times New Roman"/>
-          <w:b/>
-          <w:sz w:val="24"/>
-        </w:rPr>
         <w:t>Test Case 1 - Translation (tx=4, ty=3)</w:t>
       </w:r>
     </w:p>

</xml_diff>